<commit_message>
Curated reproducibility package: Round-8 fixes + Zenodo DOI 10.5281/zenodo.22896666
- Recompute weighted-median MR estimates (50% cumulative-weight off-by-one fix)
- Correct CHARLS m0 interaction statement (significant positive, p<0.001)
- Add Ethics approval & consent and Acknowledgements declarations
- Fill real Zenodo DOI in Data availability and CITATION.cff
</commit_message>
<xml_diff>
--- a/docs/submission/_upload/Cover_Letter.docx
+++ b/docs/submission/_upload/Cover_Letter.docx
@@ -71,7 +71,7 @@
           <w:b w:val="0"/>
           <w:i w:val="0"/>
         </w:rPr>
-        <w:t xml:space="preserve"> 20 September 2026</w:t>
+        <w:t xml:space="preserve"> 21 September 2026</w:t>
       </w:r>
     </w:p>
     <w:p>
@@ -147,7 +147,7 @@
           <w:b w:val="0"/>
           <w:i/>
         </w:rPr>
-        <w:t>"Genetically predicted multisite chronic pain is associated with lower cognitive performance: a bidirectional Mendelian randomization study with NHANES contextual evidence"</w:t>
+        <w:t>"Genetically predicted multisite chronic pain is associated with lower cognitive performance: a bidirectional Mendelian randomization study with NHANES and CHARLS longitudinal evidence"</w:t>
       </w:r>
       <w:r>
         <w:rPr>
@@ -192,7 +192,7 @@
           <w:b w:val="0"/>
           <w:i w:val="0"/>
         </w:rPr>
-        <w:t xml:space="preserve"> Chronic pain and cognitive impairment are two escalating, ageing-related public-health burdens. Observational links between multisite chronic pain (MCP) and cognitive decline are confounded by reverse causation and shared comorbidity. Using bidirectional two-sample Mendelian randomization (MR) with up to 51 independent genetic instruments for multisite chronic pain (MCP; UK Biobank, n=387,649), we estimate the effect of genetically predicted MCP on cognitive performance, Alzheimer's disease, and all-cause dementia, and probe the reverse direction and candidate mediators.</w:t>
+        <w:t xml:space="preserve"> Chronic pain and cognitive impairment are two escalating, ageing-related public-health burdens. Observational links between multisite chronic pain (MCP) and cognitive decline are confounded by reverse causation and shared comorbidity. Using bidirectional two-sample Mendelian randomization (MR) with up to 43 independent genetic instruments for MCP (UK Biobank, n=387,649), we estimate the effect of genetically predicted MCP on cognitive performance, Alzheimer's disease, and all-cause dementia, and probe the reverse direction and candidate mediators. We further embed the genetic findings in two population-based cohorts: the US NHANES (descriptive correlates of subjective memory complaint) and the Chinese CHARLS 2011-2015 longitudinal study of pain-site burden and cognitive decline.</w:t>
       </w:r>
     </w:p>
     <w:p>
@@ -213,7 +213,7 @@
           <w:b w:val="0"/>
           <w:i w:val="0"/>
         </w:rPr>
-        <w:t xml:space="preserve"> Genetically predicted MCP was associated with lower cognitive performance (IVW β=−0.361, 95% CI −0.424 to −0.299, p=3.65×10⁻³⁰), with high heterogeneity (I²≈83.5%) but no directional pleiotropy. A non-significant Steiger test and a significant reverse MR left causal direction unresolved, and the cognitive result is limited by UK Biobank sample overlap between exposure and outcome. A non-UKB overlap-robustness re-interpretation (IGAP Alzheimer's disease: β=0.466, p=0.008) corroborated the association independently of this overlap. No mediator was significant. We report these results with explicit attention to their limitations rather than overstated causal claims.</w:t>
+        <w:t xml:space="preserve"> Genetically predicted MCP was associated with lower cognitive performance (IVW beta=-0.361, 95% CI -0.424 to -0.299, p=3.65x10-30), with high heterogeneity (I2~83.5%) but no directional pleiotropy. A non-significant Steiger test (p=0.23) and a significant reverse MR (beta=-0.171, p=8.85x10-58) left causal direction unresolved; the cognitive result is constrained by UK Biobank sample overlap between exposure and outcome. A non-UKB overlap-robustness re-interpretation (IGAP Alzheimer's disease: beta=0.466, p=0.008) and a formal overlap-bias quantification (Burgess-Thompson / MRlap framework; &lt;=3% bias) corroborated the association independently of this overlap. No mediator was significant. In CHARLS (n=25,762), greater pain-site burden was cross-sectionally associated with lower cognition (beta=-0.011 per site, p&lt;0.001) with a significant dose-response, but did not significantly accelerate four-year cognitive decline (painxtime p=0.70) or predict incident worst-quartile impairment (Cox HR 1.006, p=0.53); a four-wave sensitivity extension and a change-score sensitivity produced null or divergent, cautiously interpreted longitudinal signals. We report these results with explicit attention to their limitations rather than overstated causal claims.</w:t>
       </w:r>
     </w:p>
     <w:p>
@@ -250,7 +250,7 @@
           <w:b w:val="0"/>
           <w:i w:val="0"/>
         </w:rPr>
-        <w:t xml:space="preserve"> is well suited to a transparent, hypothesis-generating MR study that foregrounds its own constraints. The work conforms to the STROBE-MR 2021 reporting guideline (checklist enclosed).</w:t>
+        <w:t xml:space="preserve"> is well suited to a transparent, hypothesis-generating MR study that foregrounds its own constraints, complemented by longitudinal cohort corroboration. The work conforms to the STROBE-MR 2021 reporting guideline (checklist enclosed).</w:t>
       </w:r>
     </w:p>
     <w:p>

</xml_diff>